<commit_message>
Documentation: add spec 4.5.2 and 4.6.0, Florida Bar validation guide
- Add JACS_Tech_Spec_Version_4_5_2.docx and 4_6_0.docx.
- Add "Florida Bar API Member Validation.pdf".
- Update 4_5_1; remove 4_5_4 and the loose screenshots.

Co-Authored-By: Claude Opus 5.5 <noreply@anthropic.com>
</commit_message>
<xml_diff>
--- a/Documentation/JACS_Tech_Spec_Version_4_5_1.docx
+++ b/Documentation/JACS_Tech_Spec_Version_4_5_1.docx
@@ -38,13 +38,20 @@
           <w:b/>
           <w:bCs/>
         </w:rPr>
-        <w:t>.1</w:t>
+        <w:t>.</w:t>
       </w:r>
       <w:r>
         <w:rPr>
           <w:b/>
           <w:bCs/>
         </w:rPr>
+        <w:t>2</w:t>
+      </w:r>
+      <w:r>
+        <w:rPr>
+          <w:b/>
+          <w:bCs/>
+        </w:rPr>
         <w:t>)</w:t>
       </w:r>
     </w:p>
@@ -224,10 +231,42 @@
           <w:b/>
           <w:bCs/>
         </w:rPr>
-        <w:t>/getCase Exception</w:t>
-      </w:r>
-      <w:r>
-        <w:t>: The /getCase endpoint additionally requires the UserCredentials field in the request body for user-level security trimming. The JWT Bearer token is still required in the header.</w:t>
+        <w:t>/</w:t>
+      </w:r>
+      <w:proofErr w:type="spellStart"/>
+      <w:r>
+        <w:rPr>
+          <w:b/>
+          <w:bCs/>
+        </w:rPr>
+        <w:t>getCase</w:t>
+      </w:r>
+      <w:proofErr w:type="spellEnd"/>
+      <w:r>
+        <w:rPr>
+          <w:b/>
+          <w:bCs/>
+        </w:rPr>
+        <w:t xml:space="preserve"> Exception</w:t>
+      </w:r>
+      <w:r>
+        <w:t>: The /</w:t>
+      </w:r>
+      <w:proofErr w:type="spellStart"/>
+      <w:r>
+        <w:t>getCase</w:t>
+      </w:r>
+      <w:proofErr w:type="spellEnd"/>
+      <w:r>
+        <w:t xml:space="preserve"> endpoint additionally requires the </w:t>
+      </w:r>
+      <w:proofErr w:type="spellStart"/>
+      <w:r>
+        <w:t>UserCredentials</w:t>
+      </w:r>
+      <w:proofErr w:type="spellEnd"/>
+      <w:r>
+        <w:t xml:space="preserve"> field in the request body for user-level security trimming. The JWT Bearer token is still required in the header.</w:t>
       </w:r>
     </w:p>
     <w:p>
@@ -255,12 +294,25 @@
         <w:t>must</w:t>
       </w:r>
       <w:r>
-        <w:t xml:space="preserve"> use the exact format yyyy-MM-dd HH:</w:t>
+        <w:t xml:space="preserve"> use the exact format </w:t>
+      </w:r>
+      <w:proofErr w:type="spellStart"/>
+      <w:r>
+        <w:t>yyyy</w:t>
+      </w:r>
+      <w:proofErr w:type="spellEnd"/>
+      <w:r>
+        <w:t xml:space="preserve">-MM-dd </w:t>
+      </w:r>
+      <w:proofErr w:type="spellStart"/>
+      <w:r>
+        <w:t>HH:</w:t>
       </w:r>
       <w:proofErr w:type="gramStart"/>
       <w:r>
         <w:t>mm:ss</w:t>
       </w:r>
+      <w:proofErr w:type="spellEnd"/>
       <w:proofErr w:type="gramEnd"/>
       <w:r>
         <w:t xml:space="preserve"> </w:t>
@@ -347,7 +399,15 @@
         <w:t>"New"</w:t>
       </w:r>
       <w:r>
-        <w:t xml:space="preserve"> (createEvent), </w:t>
+        <w:t xml:space="preserve"> (</w:t>
+      </w:r>
+      <w:proofErr w:type="spellStart"/>
+      <w:r>
+        <w:t>createEvent</w:t>
+      </w:r>
+      <w:proofErr w:type="spellEnd"/>
+      <w:r>
+        <w:t xml:space="preserve">), </w:t>
       </w:r>
       <w:r>
         <w:rPr>
@@ -356,7 +416,15 @@
         <w:t>"Update"</w:t>
       </w:r>
       <w:r>
-        <w:t xml:space="preserve"> (updateEvent), </w:t>
+        <w:t xml:space="preserve"> (</w:t>
+      </w:r>
+      <w:proofErr w:type="spellStart"/>
+      <w:r>
+        <w:t>updateEvent</w:t>
+      </w:r>
+      <w:proofErr w:type="spellEnd"/>
+      <w:r>
+        <w:t xml:space="preserve">), </w:t>
       </w:r>
       <w:r>
         <w:rPr>
@@ -365,7 +433,23 @@
         <w:t>"Modify"</w:t>
       </w:r>
       <w:r>
-        <w:t xml:space="preserve"> (rescheduleEvent – NewEvent object only)</w:t>
+        <w:t xml:space="preserve"> (</w:t>
+      </w:r>
+      <w:proofErr w:type="spellStart"/>
+      <w:r>
+        <w:t>rescheduleEvent</w:t>
+      </w:r>
+      <w:proofErr w:type="spellEnd"/>
+      <w:r>
+        <w:t xml:space="preserve"> – </w:t>
+      </w:r>
+      <w:proofErr w:type="spellStart"/>
+      <w:r>
+        <w:t>NewEvent</w:t>
+      </w:r>
+      <w:proofErr w:type="spellEnd"/>
+      <w:r>
+        <w:t xml:space="preserve"> object only)</w:t>
       </w:r>
       <w:r>
         <w:t xml:space="preserve">, </w:t>
@@ -378,7 +462,15 @@
         <w:t>“Cancel”</w:t>
       </w:r>
       <w:r>
-        <w:t xml:space="preserve"> (cancelEvent)</w:t>
+        <w:t xml:space="preserve"> (</w:t>
+      </w:r>
+      <w:proofErr w:type="spellStart"/>
+      <w:r>
+        <w:t>cancelEvent</w:t>
+      </w:r>
+      <w:proofErr w:type="spellEnd"/>
+      <w:r>
+        <w:t>)</w:t>
       </w:r>
       <w:r>
         <w:t>.</w:t>
@@ -391,6 +483,7 @@
           <w:numId w:val="1"/>
         </w:numPr>
       </w:pPr>
+      <w:proofErr w:type="spellStart"/>
       <w:r>
         <w:rPr>
           <w:b/>
@@ -398,6 +491,7 @@
         </w:rPr>
         <w:t>OtherEventType</w:t>
       </w:r>
+      <w:proofErr w:type="spellEnd"/>
       <w:r>
         <w:t xml:space="preserve">: Optional free-text field used when the event type </w:t>
       </w:r>
@@ -432,6 +526,7 @@
       <w:r>
         <w:t xml:space="preserve">ield </w:t>
       </w:r>
+      <w:proofErr w:type="spellStart"/>
       <w:r>
         <w:t>Event</w:t>
       </w:r>
@@ -439,7 +534,11 @@
         <w:t>T</w:t>
       </w:r>
       <w:r>
-        <w:t xml:space="preserve">ype will contain the value </w:t>
+        <w:t>ype</w:t>
+      </w:r>
+      <w:proofErr w:type="spellEnd"/>
+      <w:r>
+        <w:t xml:space="preserve"> will contain the value </w:t>
       </w:r>
       <w:r>
         <w:t>“</w:t>
@@ -453,11 +552,16 @@
       <w:r>
         <w:t xml:space="preserve">the field </w:t>
       </w:r>
+      <w:proofErr w:type="spellStart"/>
       <w:r>
         <w:t>Other</w:t>
       </w:r>
       <w:r>
-        <w:t>EventType will contain the custom value enter by the user.</w:t>
+        <w:t>EventType</w:t>
+      </w:r>
+      <w:proofErr w:type="spellEnd"/>
+      <w:r>
+        <w:t xml:space="preserve"> will contain the custom value enter by the user.</w:t>
       </w:r>
     </w:p>
     <w:p>
@@ -477,12 +581,14 @@
       <w:r>
         <w:t xml:space="preserve">: Unless noted otherwise, all fields shown in request body examples are required. The following fields are optional: </w:t>
       </w:r>
+      <w:proofErr w:type="spellStart"/>
       <w:r>
         <w:rPr>
           <w:i/>
         </w:rPr>
         <w:t>OtherEventType</w:t>
       </w:r>
+      <w:proofErr w:type="spellEnd"/>
       <w:r>
         <w:t xml:space="preserve">, </w:t>
       </w:r>
@@ -511,7 +617,39 @@
         <w:t>Reason</w:t>
       </w:r>
       <w:r>
-        <w:t xml:space="preserve"> (updateEvent/cancelEvent). All fields in the CurrentEvent object of rescheduleEvent are required.</w:t>
+        <w:t xml:space="preserve"> (</w:t>
+      </w:r>
+      <w:proofErr w:type="spellStart"/>
+      <w:r>
+        <w:t>updateEvent</w:t>
+      </w:r>
+      <w:proofErr w:type="spellEnd"/>
+      <w:r>
+        <w:t>/</w:t>
+      </w:r>
+      <w:proofErr w:type="spellStart"/>
+      <w:r>
+        <w:t>cancelEvent</w:t>
+      </w:r>
+      <w:proofErr w:type="spellEnd"/>
+      <w:r>
+        <w:t xml:space="preserve">). All fields in the </w:t>
+      </w:r>
+      <w:proofErr w:type="spellStart"/>
+      <w:r>
+        <w:t>CurrentEvent</w:t>
+      </w:r>
+      <w:proofErr w:type="spellEnd"/>
+      <w:r>
+        <w:t xml:space="preserve"> object of </w:t>
+      </w:r>
+      <w:proofErr w:type="spellStart"/>
+      <w:r>
+        <w:t>rescheduleEvent</w:t>
+      </w:r>
+      <w:proofErr w:type="spellEnd"/>
+      <w:r>
+        <w:t xml:space="preserve"> are required.</w:t>
       </w:r>
     </w:p>
     <w:p>
@@ -617,8 +755,13 @@
         <w:t>Endpoint</w:t>
       </w:r>
       <w:r>
-        <w:t>: POST /createEvent</w:t>
-      </w:r>
+        <w:t>: POST /</w:t>
+      </w:r>
+      <w:proofErr w:type="spellStart"/>
+      <w:r>
+        <w:t>createEvent</w:t>
+      </w:r>
+      <w:proofErr w:type="spellEnd"/>
     </w:p>
     <w:p>
       <w:pPr>
@@ -669,11 +812,27 @@
         <w:ind w:left="720"/>
       </w:pPr>
       <w:r>
-        <w:t xml:space="preserve">  "CaseId": 12345,</w:t>
-      </w:r>
-      <w:r>
-        <w:br/>
-        <w:t xml:space="preserve">  "JudgeId": 154,</w:t>
+        <w:t xml:space="preserve">  "</w:t>
+      </w:r>
+      <w:proofErr w:type="spellStart"/>
+      <w:r>
+        <w:t>CaseId</w:t>
+      </w:r>
+      <w:proofErr w:type="spellEnd"/>
+      <w:r>
+        <w:t>": 12345,</w:t>
+      </w:r>
+      <w:r>
+        <w:br/>
+        <w:t xml:space="preserve">  "</w:t>
+      </w:r>
+      <w:proofErr w:type="spellStart"/>
+      <w:r>
+        <w:t>JudgeId</w:t>
+      </w:r>
+      <w:proofErr w:type="spellEnd"/>
+      <w:r>
+        <w:t>": 154,</w:t>
       </w:r>
       <w:r>
         <w:br/>
@@ -681,7 +840,15 @@
       </w:r>
       <w:r>
         <w:br/>
-        <w:t xml:space="preserve">  "EventType": </w:t>
+        <w:t xml:space="preserve">  "</w:t>
+      </w:r>
+      <w:proofErr w:type="spellStart"/>
+      <w:r>
+        <w:t>EventType</w:t>
+      </w:r>
+      <w:proofErr w:type="spellEnd"/>
+      <w:r>
+        <w:t xml:space="preserve">": </w:t>
       </w:r>
       <w:r>
         <w:t>"</w:t>
@@ -694,11 +861,27 @@
       </w:r>
       <w:r>
         <w:br/>
-        <w:t xml:space="preserve">  "OtherEventType": "User Value",</w:t>
-      </w:r>
-      <w:r>
-        <w:br/>
-        <w:t xml:space="preserve">  "EventDateTime": "2026-04-15 13:30:00",</w:t>
+        <w:t xml:space="preserve">  "</w:t>
+      </w:r>
+      <w:proofErr w:type="spellStart"/>
+      <w:r>
+        <w:t>OtherEventType</w:t>
+      </w:r>
+      <w:proofErr w:type="spellEnd"/>
+      <w:r>
+        <w:t>": "User Value",</w:t>
+      </w:r>
+      <w:r>
+        <w:br/>
+        <w:t xml:space="preserve">  "</w:t>
+      </w:r>
+      <w:proofErr w:type="spellStart"/>
+      <w:r>
+        <w:t>EventDateTime</w:t>
+      </w:r>
+      <w:proofErr w:type="spellEnd"/>
+      <w:r>
+        <w:t>": "2026-04-15 13:30:00",</w:t>
       </w:r>
       <w:r>
         <w:br/>
@@ -709,7 +892,15 @@
       </w:r>
       <w:r>
         <w:br/>
-        <w:t xml:space="preserve">  "CourtRoomId": 25,</w:t>
+        <w:t xml:space="preserve">  "</w:t>
+      </w:r>
+      <w:proofErr w:type="spellStart"/>
+      <w:r>
+        <w:t>CourtRoomId</w:t>
+      </w:r>
+      <w:proofErr w:type="spellEnd"/>
+      <w:r>
+        <w:t>": 25,</w:t>
       </w:r>
       <w:r>
         <w:br/>
@@ -778,8 +969,34 @@
       </w:r>
       <w:proofErr w:type="gramEnd"/>
       <w:r>
-        <w:t>data": { "EventId": 123456 }, "error": "" }</w:t>
-      </w:r>
+        <w:t xml:space="preserve">data": </w:t>
+      </w:r>
+      <w:proofErr w:type="gramStart"/>
+      <w:r>
+        <w:t>{ "</w:t>
+      </w:r>
+      <w:proofErr w:type="spellStart"/>
+      <w:proofErr w:type="gramEnd"/>
+      <w:r>
+        <w:t>EventId</w:t>
+      </w:r>
+      <w:proofErr w:type="spellEnd"/>
+      <w:r>
+        <w:t xml:space="preserve">": </w:t>
+      </w:r>
+      <w:proofErr w:type="gramStart"/>
+      <w:r>
+        <w:t>123456 }</w:t>
+      </w:r>
+      <w:proofErr w:type="gramEnd"/>
+      <w:r>
+        <w:t>, "error": "</w:t>
+      </w:r>
+      <w:proofErr w:type="gramStart"/>
+      <w:r>
+        <w:t>" }</w:t>
+      </w:r>
+      <w:proofErr w:type="gramEnd"/>
     </w:p>
     <w:p>
       <w:pPr>
@@ -797,8 +1014,13 @@
       </w:r>
       <w:proofErr w:type="gramEnd"/>
       <w:r>
-        <w:t>data": null, "error": "Descriptive error message" }</w:t>
-      </w:r>
+        <w:t>data": null, "error": "Descriptive error message</w:t>
+      </w:r>
+      <w:proofErr w:type="gramStart"/>
+      <w:r>
+        <w:t>" }</w:t>
+      </w:r>
+      <w:proofErr w:type="gramEnd"/>
     </w:p>
     <w:p>
       <w:pPr>
@@ -837,7 +1059,15 @@
         </w:numPr>
       </w:pPr>
       <w:r>
-        <w:t>Case information should be retrieved via /getCase immediately before creating the event.</w:t>
+        <w:t>Case information should be retrieved via /</w:t>
+      </w:r>
+      <w:proofErr w:type="spellStart"/>
+      <w:r>
+        <w:t>getCase</w:t>
+      </w:r>
+      <w:proofErr w:type="spellEnd"/>
+      <w:r>
+        <w:t xml:space="preserve"> immediately before creating the event.</w:t>
       </w:r>
     </w:p>
     <w:p>
@@ -863,8 +1093,13 @@
         <w:t>Endpoint</w:t>
       </w:r>
       <w:r>
-        <w:t>: POST /updateEvent</w:t>
-      </w:r>
+        <w:t>: POST /</w:t>
+      </w:r>
+      <w:proofErr w:type="spellStart"/>
+      <w:r>
+        <w:t>updateEvent</w:t>
+      </w:r>
+      <w:proofErr w:type="spellEnd"/>
     </w:p>
     <w:p>
       <w:pPr>
@@ -911,15 +1146,39 @@
       </w:r>
       <w:r>
         <w:br/>
-        <w:t xml:space="preserve">  "EventId": 123456,</w:t>
-      </w:r>
-      <w:r>
-        <w:br/>
-        <w:t xml:space="preserve">  "CaseId": 12345,</w:t>
-      </w:r>
-      <w:r>
-        <w:br/>
-        <w:t xml:space="preserve">  "JudgeId": 154,</w:t>
+        <w:t xml:space="preserve">  "</w:t>
+      </w:r>
+      <w:proofErr w:type="spellStart"/>
+      <w:r>
+        <w:t>EventId</w:t>
+      </w:r>
+      <w:proofErr w:type="spellEnd"/>
+      <w:r>
+        <w:t>": 123456,</w:t>
+      </w:r>
+      <w:r>
+        <w:br/>
+        <w:t xml:space="preserve">  "</w:t>
+      </w:r>
+      <w:proofErr w:type="spellStart"/>
+      <w:r>
+        <w:t>CaseId</w:t>
+      </w:r>
+      <w:proofErr w:type="spellEnd"/>
+      <w:r>
+        <w:t>": 12345,</w:t>
+      </w:r>
+      <w:r>
+        <w:br/>
+        <w:t xml:space="preserve">  "</w:t>
+      </w:r>
+      <w:proofErr w:type="spellStart"/>
+      <w:r>
+        <w:t>JudgeId</w:t>
+      </w:r>
+      <w:proofErr w:type="spellEnd"/>
+      <w:r>
+        <w:t>": 154,</w:t>
       </w:r>
       <w:r>
         <w:br/>
@@ -927,7 +1186,15 @@
       </w:r>
       <w:r>
         <w:br/>
-        <w:t xml:space="preserve">  "EventType": </w:t>
+        <w:t xml:space="preserve">  "</w:t>
+      </w:r>
+      <w:proofErr w:type="spellStart"/>
+      <w:r>
+        <w:t>EventType</w:t>
+      </w:r>
+      <w:proofErr w:type="spellEnd"/>
+      <w:r>
+        <w:t xml:space="preserve">": </w:t>
       </w:r>
       <w:r>
         <w:t>"Continue"</w:t>
@@ -937,11 +1204,27 @@
       </w:r>
       <w:r>
         <w:br/>
-        <w:t xml:space="preserve">  "OtherEventType": "User Value",</w:t>
-      </w:r>
-      <w:r>
-        <w:br/>
-        <w:t xml:space="preserve">  "EventDateTime": "2026-04-15 10:30:00",</w:t>
+        <w:t xml:space="preserve">  "</w:t>
+      </w:r>
+      <w:proofErr w:type="spellStart"/>
+      <w:r>
+        <w:t>OtherEventType</w:t>
+      </w:r>
+      <w:proofErr w:type="spellEnd"/>
+      <w:r>
+        <w:t>": "User Value",</w:t>
+      </w:r>
+      <w:r>
+        <w:br/>
+        <w:t xml:space="preserve">  "</w:t>
+      </w:r>
+      <w:proofErr w:type="spellStart"/>
+      <w:r>
+        <w:t>EventDateTime</w:t>
+      </w:r>
+      <w:proofErr w:type="spellEnd"/>
+      <w:r>
+        <w:t>": "2026-04-15 10:30:00",</w:t>
       </w:r>
       <w:r>
         <w:br/>
@@ -949,7 +1232,15 @@
       </w:r>
       <w:r>
         <w:br/>
-        <w:t xml:space="preserve">  "CourtRoomId": 25,</w:t>
+        <w:t xml:space="preserve">  "</w:t>
+      </w:r>
+      <w:proofErr w:type="spellStart"/>
+      <w:r>
+        <w:t>CourtRoomId</w:t>
+      </w:r>
+      <w:proofErr w:type="spellEnd"/>
+      <w:r>
+        <w:t>": 25,</w:t>
       </w:r>
       <w:r>
         <w:br/>
@@ -1025,8 +1316,34 @@
       </w:r>
       <w:proofErr w:type="gramEnd"/>
       <w:r>
-        <w:t>data": { "EventId": 123456 }, "error": "" }</w:t>
-      </w:r>
+        <w:t xml:space="preserve">data": </w:t>
+      </w:r>
+      <w:proofErr w:type="gramStart"/>
+      <w:r>
+        <w:t>{ "</w:t>
+      </w:r>
+      <w:proofErr w:type="spellStart"/>
+      <w:proofErr w:type="gramEnd"/>
+      <w:r>
+        <w:t>EventId</w:t>
+      </w:r>
+      <w:proofErr w:type="spellEnd"/>
+      <w:r>
+        <w:t xml:space="preserve">": </w:t>
+      </w:r>
+      <w:proofErr w:type="gramStart"/>
+      <w:r>
+        <w:t>123456 }</w:t>
+      </w:r>
+      <w:proofErr w:type="gramEnd"/>
+      <w:r>
+        <w:t>, "error": "</w:t>
+      </w:r>
+      <w:proofErr w:type="gramStart"/>
+      <w:r>
+        <w:t>" }</w:t>
+      </w:r>
+      <w:proofErr w:type="gramEnd"/>
     </w:p>
     <w:p>
       <w:pPr>
@@ -1044,8 +1361,13 @@
       </w:r>
       <w:proofErr w:type="gramEnd"/>
       <w:r>
-        <w:t>data": null, "error": "Descriptive error message" }</w:t>
-      </w:r>
+        <w:t>data": null, "error": "Descriptive error message</w:t>
+      </w:r>
+      <w:proofErr w:type="gramStart"/>
+      <w:r>
+        <w:t>" }</w:t>
+      </w:r>
+      <w:proofErr w:type="gramEnd"/>
     </w:p>
     <w:p>
       <w:pPr>
@@ -1070,8 +1392,13 @@
         <w:t>Endpoint</w:t>
       </w:r>
       <w:r>
-        <w:t>: POST /cancelEvent</w:t>
-      </w:r>
+        <w:t>: POST /</w:t>
+      </w:r>
+      <w:proofErr w:type="spellStart"/>
+      <w:r>
+        <w:t>cancelEvent</w:t>
+      </w:r>
+      <w:proofErr w:type="spellEnd"/>
     </w:p>
     <w:p>
       <w:pPr>
@@ -1118,7 +1445,15 @@
       </w:r>
       <w:r>
         <w:br/>
-        <w:t xml:space="preserve">  "EventId": 123456,</w:t>
+        <w:t xml:space="preserve">  "</w:t>
+      </w:r>
+      <w:proofErr w:type="spellStart"/>
+      <w:r>
+        <w:t>EventId</w:t>
+      </w:r>
+      <w:proofErr w:type="spellEnd"/>
+      <w:r>
+        <w:t>": 123456,</w:t>
       </w:r>
       <w:r>
         <w:br/>
@@ -1163,8 +1498,13 @@
       </w:r>
       <w:proofErr w:type="gramEnd"/>
       <w:r>
-        <w:t>data": {}, "error": "" }</w:t>
-      </w:r>
+        <w:t>data": {}, "error": "</w:t>
+      </w:r>
+      <w:proofErr w:type="gramStart"/>
+      <w:r>
+        <w:t>" }</w:t>
+      </w:r>
+      <w:proofErr w:type="gramEnd"/>
     </w:p>
     <w:p>
       <w:pPr>
@@ -1182,8 +1522,13 @@
       </w:r>
       <w:proofErr w:type="gramEnd"/>
       <w:r>
-        <w:t>data": null, "error": "Descriptive error message" }</w:t>
-      </w:r>
+        <w:t>data": null, "error": "Descriptive error message</w:t>
+      </w:r>
+      <w:proofErr w:type="gramStart"/>
+      <w:r>
+        <w:t>" }</w:t>
+      </w:r>
+      <w:proofErr w:type="gramEnd"/>
     </w:p>
     <w:p>
       <w:pPr>
@@ -1208,8 +1553,13 @@
         <w:t>Endpoint</w:t>
       </w:r>
       <w:r>
-        <w:t>: POST /rescheduleEvent</w:t>
-      </w:r>
+        <w:t>: POST /</w:t>
+      </w:r>
+      <w:proofErr w:type="spellStart"/>
+      <w:r>
+        <w:t>rescheduleEvent</w:t>
+      </w:r>
+      <w:proofErr w:type="spellEnd"/>
     </w:p>
     <w:p>
       <w:pPr>
@@ -1256,22 +1606,54 @@
       </w:r>
       <w:r>
         <w:br/>
-        <w:t xml:space="preserve">    "NewEvent": {</w:t>
+        <w:t xml:space="preserve">    "</w:t>
+      </w:r>
+      <w:proofErr w:type="spellStart"/>
+      <w:r>
+        <w:t>NewEvent</w:t>
+      </w:r>
+      <w:proofErr w:type="spellEnd"/>
+      <w:r>
+        <w:t>": {</w:t>
       </w:r>
       <w:r>
         <w:br/>
       </w:r>
       <w:r>
         <w:lastRenderedPageBreak/>
-        <w:t xml:space="preserve">      "EventId": 123456,</w:t>
-      </w:r>
-      <w:r>
-        <w:br/>
-        <w:t xml:space="preserve">      "CaseId": 12345,</w:t>
-      </w:r>
-      <w:r>
-        <w:br/>
-        <w:t xml:space="preserve">      "JudgeId": 154,</w:t>
+        <w:t xml:space="preserve">      "</w:t>
+      </w:r>
+      <w:proofErr w:type="spellStart"/>
+      <w:r>
+        <w:t>EventId</w:t>
+      </w:r>
+      <w:proofErr w:type="spellEnd"/>
+      <w:r>
+        <w:t>": 123456,</w:t>
+      </w:r>
+      <w:r>
+        <w:br/>
+        <w:t xml:space="preserve">      "</w:t>
+      </w:r>
+      <w:proofErr w:type="spellStart"/>
+      <w:r>
+        <w:t>CaseId</w:t>
+      </w:r>
+      <w:proofErr w:type="spellEnd"/>
+      <w:r>
+        <w:t>": 12345,</w:t>
+      </w:r>
+      <w:r>
+        <w:br/>
+        <w:t xml:space="preserve">      "</w:t>
+      </w:r>
+      <w:proofErr w:type="spellStart"/>
+      <w:r>
+        <w:t>JudgeId</w:t>
+      </w:r>
+      <w:proofErr w:type="spellEnd"/>
+      <w:r>
+        <w:t>": 154,</w:t>
       </w:r>
       <w:r>
         <w:br/>
@@ -1279,7 +1661,15 @@
       </w:r>
       <w:r>
         <w:br/>
-        <w:t xml:space="preserve">      "EventType": </w:t>
+        <w:t xml:space="preserve">      "</w:t>
+      </w:r>
+      <w:proofErr w:type="spellStart"/>
+      <w:r>
+        <w:t>EventType</w:t>
+      </w:r>
+      <w:proofErr w:type="spellEnd"/>
+      <w:r>
+        <w:t xml:space="preserve">": </w:t>
       </w:r>
       <w:r>
         <w:t>"Continue"</w:t>
@@ -1289,11 +1679,27 @@
       </w:r>
       <w:r>
         <w:br/>
-        <w:t xml:space="preserve">      "OtherEventType": "User Value",</w:t>
-      </w:r>
-      <w:r>
-        <w:br/>
-        <w:t xml:space="preserve">      "EventDateTime": "2026-04-15 10:30:00",</w:t>
+        <w:t xml:space="preserve">      "</w:t>
+      </w:r>
+      <w:proofErr w:type="spellStart"/>
+      <w:r>
+        <w:t>OtherEventType</w:t>
+      </w:r>
+      <w:proofErr w:type="spellEnd"/>
+      <w:r>
+        <w:t>": "User Value",</w:t>
+      </w:r>
+      <w:r>
+        <w:br/>
+        <w:t xml:space="preserve">      "</w:t>
+      </w:r>
+      <w:proofErr w:type="spellStart"/>
+      <w:r>
+        <w:t>EventDateTime</w:t>
+      </w:r>
+      <w:proofErr w:type="spellEnd"/>
+      <w:r>
+        <w:t>": "2026-04-15 10:30:00",</w:t>
       </w:r>
       <w:r>
         <w:br/>
@@ -1301,7 +1707,15 @@
       </w:r>
       <w:r>
         <w:br/>
-        <w:t xml:space="preserve">      "CourtRoomId": 25,</w:t>
+        <w:t xml:space="preserve">      "</w:t>
+      </w:r>
+      <w:proofErr w:type="spellStart"/>
+      <w:r>
+        <w:t>CourtRoomId</w:t>
+      </w:r>
+      <w:proofErr w:type="spellEnd"/>
+      <w:r>
+        <w:t>": 25,</w:t>
       </w:r>
       <w:r>
         <w:br/>
@@ -1337,15 +1751,39 @@
       </w:r>
       <w:r>
         <w:br/>
-        <w:t xml:space="preserve">  "CurrentEvent": {</w:t>
-      </w:r>
-      <w:r>
-        <w:br/>
-        <w:t xml:space="preserve">      "EventDateTime": "2026-04-10 09:00:00",</w:t>
-      </w:r>
-      <w:r>
-        <w:br/>
-        <w:t xml:space="preserve">      "CourtRoomId": 18,</w:t>
+        <w:t xml:space="preserve">  "</w:t>
+      </w:r>
+      <w:proofErr w:type="spellStart"/>
+      <w:r>
+        <w:t>CurrentEvent</w:t>
+      </w:r>
+      <w:proofErr w:type="spellEnd"/>
+      <w:r>
+        <w:t>": {</w:t>
+      </w:r>
+      <w:r>
+        <w:br/>
+        <w:t xml:space="preserve">      "</w:t>
+      </w:r>
+      <w:proofErr w:type="spellStart"/>
+      <w:r>
+        <w:t>EventDateTime</w:t>
+      </w:r>
+      <w:proofErr w:type="spellEnd"/>
+      <w:r>
+        <w:t>": "2026-04-10 09:00:00",</w:t>
+      </w:r>
+      <w:r>
+        <w:br/>
+        <w:t xml:space="preserve">      "</w:t>
+      </w:r>
+      <w:proofErr w:type="spellStart"/>
+      <w:r>
+        <w:t>CourtRoomId</w:t>
+      </w:r>
+      <w:proofErr w:type="spellEnd"/>
+      <w:r>
+        <w:t>": 18,</w:t>
       </w:r>
       <w:r>
         <w:br/>
@@ -1353,11 +1791,27 @@
       </w:r>
       <w:r>
         <w:br/>
-        <w:t xml:space="preserve">      "JudgeId": 154,</w:t>
-      </w:r>
-      <w:r>
-        <w:br/>
-        <w:t xml:space="preserve">      "EventType": </w:t>
+        <w:t xml:space="preserve">      "</w:t>
+      </w:r>
+      <w:proofErr w:type="spellStart"/>
+      <w:r>
+        <w:t>JudgeId</w:t>
+      </w:r>
+      <w:proofErr w:type="spellEnd"/>
+      <w:r>
+        <w:t>": 154,</w:t>
+      </w:r>
+      <w:r>
+        <w:br/>
+        <w:t xml:space="preserve">      "</w:t>
+      </w:r>
+      <w:proofErr w:type="spellStart"/>
+      <w:r>
+        <w:t>EventType</w:t>
+      </w:r>
+      <w:proofErr w:type="spellEnd"/>
+      <w:r>
+        <w:t xml:space="preserve">": </w:t>
       </w:r>
       <w:r>
         <w:t>"Continue"</w:t>
@@ -1435,15 +1889,13 @@
         </w:numPr>
       </w:pPr>
       <w:r>
-        <w:t xml:space="preserve">Success (200): </w:t>
-      </w:r>
-      <w:proofErr w:type="gramStart"/>
-      <w:r>
-        <w:t>{ "</w:t>
-      </w:r>
-      <w:proofErr w:type="gramEnd"/>
-      <w:r>
-        <w:t>data": {}, "error": "" }</w:t>
+        <w:t>Success (200): { "data": {</w:t>
+      </w:r>
+      <w:r>
+        <w:t xml:space="preserve"> </w:t>
+      </w:r>
+      <w:r>
+        <w:t>}, "error": "" }</w:t>
       </w:r>
     </w:p>
     <w:p>
@@ -1463,8 +1915,13 @@
       </w:r>
       <w:proofErr w:type="gramEnd"/>
       <w:r>
-        <w:t>data": null, "error": "Descriptive error message" }</w:t>
-      </w:r>
+        <w:t>data": null, "error": "Descriptive error message</w:t>
+      </w:r>
+      <w:proofErr w:type="gramStart"/>
+      <w:r>
+        <w:t>" }</w:t>
+      </w:r>
+      <w:proofErr w:type="gramEnd"/>
     </w:p>
     <w:p>
       <w:pPr>
@@ -1497,8 +1954,13 @@
         <w:t>Endpoint</w:t>
       </w:r>
       <w:r>
-        <w:t>: POST /getCase</w:t>
-      </w:r>
+        <w:t>: POST /</w:t>
+      </w:r>
+      <w:proofErr w:type="spellStart"/>
+      <w:r>
+        <w:t>getCase</w:t>
+      </w:r>
+      <w:proofErr w:type="spellEnd"/>
     </w:p>
     <w:p>
       <w:pPr>
@@ -1515,7 +1977,15 @@
         <w:t>Description</w:t>
       </w:r>
       <w:r>
-        <w:t>: Retrieves case details from the Clerk System. Security trimmed based on user’s access. May return multiple results. Called when creating a new event. CaseId will be stored with the event and returned on all subsequent related requests.</w:t>
+        <w:t xml:space="preserve">: Retrieves case details from the Clerk System. Security trimmed based on user’s access. May return multiple results. Called when creating a new event. </w:t>
+      </w:r>
+      <w:proofErr w:type="spellStart"/>
+      <w:r>
+        <w:t>CaseId</w:t>
+      </w:r>
+      <w:proofErr w:type="spellEnd"/>
+      <w:r>
+        <w:t xml:space="preserve"> will be stored with the event and returned on all subsequent related requests.</w:t>
       </w:r>
     </w:p>
     <w:p>
@@ -1545,27 +2015,83 @@
       </w:r>
       <w:r>
         <w:br/>
-        <w:t xml:space="preserve">  "CaseId": 12345,</w:t>
-      </w:r>
-      <w:r>
-        <w:br/>
-        <w:t xml:space="preserve">  "CaseNumber": "58-2025-SC-006484-XXXA-SC",</w:t>
-      </w:r>
-      <w:r>
-        <w:br/>
-        <w:t xml:space="preserve">  "BarNumber": "0001011",</w:t>
-      </w:r>
-      <w:r>
-        <w:br/>
-        <w:t xml:space="preserve">  "RequestorEmail": "John Law",</w:t>
-      </w:r>
-      <w:r>
-        <w:br/>
-        <w:t xml:space="preserve">  "UserCredentials": "0khlP*&amp;YH O*&amp;tg o*&amp;6g",</w:t>
-      </w:r>
-      <w:r>
-        <w:br/>
-        <w:t xml:space="preserve">  "IsJudge": 0</w:t>
+        <w:t xml:space="preserve">  "</w:t>
+      </w:r>
+      <w:proofErr w:type="spellStart"/>
+      <w:r>
+        <w:t>CaseId</w:t>
+      </w:r>
+      <w:proofErr w:type="spellEnd"/>
+      <w:r>
+        <w:t>": 12345,</w:t>
+      </w:r>
+      <w:r>
+        <w:br/>
+        <w:t xml:space="preserve">  "</w:t>
+      </w:r>
+      <w:proofErr w:type="spellStart"/>
+      <w:r>
+        <w:t>CaseNumber</w:t>
+      </w:r>
+      <w:proofErr w:type="spellEnd"/>
+      <w:r>
+        <w:t>": "58-2025-SC-006484-XXXA-SC",</w:t>
+      </w:r>
+      <w:r>
+        <w:br/>
+        <w:t xml:space="preserve">  "</w:t>
+      </w:r>
+      <w:proofErr w:type="spellStart"/>
+      <w:r>
+        <w:t>BarNumber</w:t>
+      </w:r>
+      <w:proofErr w:type="spellEnd"/>
+      <w:r>
+        <w:t>": "0001011",</w:t>
+      </w:r>
+      <w:r>
+        <w:br/>
+        <w:t xml:space="preserve">  "</w:t>
+      </w:r>
+      <w:proofErr w:type="spellStart"/>
+      <w:r>
+        <w:t>RequestorEmail</w:t>
+      </w:r>
+      <w:proofErr w:type="spellEnd"/>
+      <w:r>
+        <w:t>": "John Law",</w:t>
+      </w:r>
+      <w:r>
+        <w:br/>
+        <w:t xml:space="preserve">  "</w:t>
+      </w:r>
+      <w:proofErr w:type="spellStart"/>
+      <w:r>
+        <w:t>UserCredentials</w:t>
+      </w:r>
+      <w:proofErr w:type="spellEnd"/>
+      <w:r>
+        <w:t>": "0khlP*&amp;YH O*&amp;</w:t>
+      </w:r>
+      <w:proofErr w:type="spellStart"/>
+      <w:r>
+        <w:t>tg</w:t>
+      </w:r>
+      <w:proofErr w:type="spellEnd"/>
+      <w:r>
+        <w:t xml:space="preserve"> o*&amp;6g",</w:t>
+      </w:r>
+      <w:r>
+        <w:br/>
+        <w:t xml:space="preserve">  "</w:t>
+      </w:r>
+      <w:proofErr w:type="spellStart"/>
+      <w:r>
+        <w:t>IsJudge</w:t>
+      </w:r>
+      <w:proofErr w:type="spellEnd"/>
+      <w:r>
+        <w:t>": 0</w:t>
       </w:r>
       <w:r>
         <w:br/>
@@ -1607,11 +2133,27 @@
       </w:r>
       <w:r>
         <w:br/>
-        <w:t xml:space="preserve">      "CaseId": 12345,</w:t>
-      </w:r>
-      <w:r>
-        <w:br/>
-        <w:t xml:space="preserve">      "CaseNumber": "58-2025-SC-006484-XXXA-SC",</w:t>
+        <w:t xml:space="preserve">      "</w:t>
+      </w:r>
+      <w:proofErr w:type="spellStart"/>
+      <w:r>
+        <w:t>CaseId</w:t>
+      </w:r>
+      <w:proofErr w:type="spellEnd"/>
+      <w:r>
+        <w:t>": 12345,</w:t>
+      </w:r>
+      <w:r>
+        <w:br/>
+        <w:t xml:space="preserve">      "</w:t>
+      </w:r>
+      <w:proofErr w:type="spellStart"/>
+      <w:r>
+        <w:t>CaseNumber</w:t>
+      </w:r>
+      <w:proofErr w:type="spellEnd"/>
+      <w:r>
+        <w:t>": "58-2025-SC-006484-XXXA-SC",</w:t>
       </w:r>
       <w:r>
         <w:br/>
@@ -1623,11 +2165,27 @@
       </w:r>
       <w:r>
         <w:br/>
-        <w:t xml:space="preserve">      "PetitionerAttyBar": "0001587",</w:t>
-      </w:r>
-      <w:r>
-        <w:br/>
-        <w:t xml:space="preserve">      "PetitionerEmail": "attorney@lawfirm.com",</w:t>
+        <w:t xml:space="preserve">      "</w:t>
+      </w:r>
+      <w:proofErr w:type="spellStart"/>
+      <w:r>
+        <w:t>PetitionerAttyBar</w:t>
+      </w:r>
+      <w:proofErr w:type="spellEnd"/>
+      <w:r>
+        <w:t>": "0001587",</w:t>
+      </w:r>
+      <w:r>
+        <w:br/>
+        <w:t xml:space="preserve">      "</w:t>
+      </w:r>
+      <w:proofErr w:type="spellStart"/>
+      <w:r>
+        <w:t>PetitionerEmail</w:t>
+      </w:r>
+      <w:proofErr w:type="spellEnd"/>
+      <w:r>
+        <w:t>": "attorney@lawfirm.com",</w:t>
       </w:r>
       <w:r>
         <w:br/>
@@ -1635,7 +2193,15 @@
       </w:r>
       <w:r>
         <w:br/>
-        <w:t xml:space="preserve">      "RespondentAttyBar": "0154871",</w:t>
+        <w:t xml:space="preserve">      "</w:t>
+      </w:r>
+      <w:proofErr w:type="spellStart"/>
+      <w:r>
+        <w:t>RespondentAttyBar</w:t>
+      </w:r>
+      <w:proofErr w:type="spellEnd"/>
+      <w:r>
+        <w:t>": "0154871",</w:t>
       </w:r>
       <w:r>
         <w:br/>
@@ -1705,16 +2271,34 @@
           <w:numId w:val="12"/>
         </w:numPr>
       </w:pPr>
-      <w:r>
-        <w:t xml:space="preserve">IsJudge is a Boolean value:0=false, 1=true. When the request is sent by a judge or JA the </w:t>
-      </w:r>
+      <w:proofErr w:type="spellStart"/>
+      <w:r>
+        <w:t>IsJudge</w:t>
+      </w:r>
+      <w:proofErr w:type="spellEnd"/>
+      <w:r>
+        <w:t xml:space="preserve"> is a Boolean value:0=false, 1=true. When the request is sent by a judge or JA the </w:t>
+      </w:r>
+      <w:proofErr w:type="spellStart"/>
       <w:proofErr w:type="gramStart"/>
       <w:r>
-        <w:t>Barnumber, and</w:t>
+        <w:t>Barnumber</w:t>
+      </w:r>
+      <w:proofErr w:type="spellEnd"/>
+      <w:r>
+        <w:t>, and</w:t>
       </w:r>
       <w:proofErr w:type="gramEnd"/>
       <w:r>
-        <w:t xml:space="preserve"> UserCredentials will be empty strings.</w:t>
+        <w:t xml:space="preserve"> </w:t>
+      </w:r>
+      <w:proofErr w:type="spellStart"/>
+      <w:r>
+        <w:t>UserCredentials</w:t>
+      </w:r>
+      <w:proofErr w:type="spellEnd"/>
+      <w:r>
+        <w:t xml:space="preserve"> will be empty strings.</w:t>
       </w:r>
     </w:p>
     <w:p>
@@ -1724,8 +2308,21 @@
           <w:numId w:val="12"/>
         </w:numPr>
       </w:pPr>
-      <w:r>
-        <w:t>CaseId will be null when creating a new event; CaseNumber will be null for existing events.</w:t>
+      <w:proofErr w:type="spellStart"/>
+      <w:r>
+        <w:t>CaseId</w:t>
+      </w:r>
+      <w:proofErr w:type="spellEnd"/>
+      <w:r>
+        <w:t xml:space="preserve"> will be null when creating a new event; </w:t>
+      </w:r>
+      <w:proofErr w:type="spellStart"/>
+      <w:r>
+        <w:t>CaseNumber</w:t>
+      </w:r>
+      <w:proofErr w:type="spellEnd"/>
+      <w:r>
+        <w:t xml:space="preserve"> will be null for existing events.</w:t>
       </w:r>
     </w:p>
     <w:p>
@@ -1762,8 +2359,13 @@
         <w:t>Endpoint</w:t>
       </w:r>
       <w:r>
-        <w:t>: POST /getEvent</w:t>
-      </w:r>
+        <w:t>: POST /</w:t>
+      </w:r>
+      <w:proofErr w:type="spellStart"/>
+      <w:r>
+        <w:t>getEvent</w:t>
+      </w:r>
+      <w:proofErr w:type="spellEnd"/>
     </w:p>
     <w:p>
       <w:pPr>
@@ -1818,7 +2420,15 @@
       </w:r>
       <w:r>
         <w:br/>
-        <w:t xml:space="preserve">  "EventId": 151635</w:t>
+        <w:t xml:space="preserve">  "</w:t>
+      </w:r>
+      <w:proofErr w:type="spellStart"/>
+      <w:r>
+        <w:t>EventId</w:t>
+      </w:r>
+      <w:proofErr w:type="spellEnd"/>
+      <w:r>
+        <w:t>": 151635</w:t>
       </w:r>
       <w:r>
         <w:br/>
@@ -1856,19 +2466,51 @@
       </w:r>
       <w:r>
         <w:br/>
-        <w:t xml:space="preserve">    "EventId": 151635,</w:t>
-      </w:r>
-      <w:r>
-        <w:br/>
-        <w:t xml:space="preserve">    "CaseId": 12345,</w:t>
-      </w:r>
-      <w:r>
-        <w:br/>
-        <w:t xml:space="preserve">    "JudgeId": 154,</w:t>
-      </w:r>
-      <w:r>
-        <w:br/>
-        <w:t xml:space="preserve">    "EventType": </w:t>
+        <w:t xml:space="preserve">    "</w:t>
+      </w:r>
+      <w:proofErr w:type="spellStart"/>
+      <w:r>
+        <w:t>EventId</w:t>
+      </w:r>
+      <w:proofErr w:type="spellEnd"/>
+      <w:r>
+        <w:t>": 151635,</w:t>
+      </w:r>
+      <w:r>
+        <w:br/>
+        <w:t xml:space="preserve">    "</w:t>
+      </w:r>
+      <w:proofErr w:type="spellStart"/>
+      <w:r>
+        <w:t>CaseId</w:t>
+      </w:r>
+      <w:proofErr w:type="spellEnd"/>
+      <w:r>
+        <w:t>": 12345,</w:t>
+      </w:r>
+      <w:r>
+        <w:br/>
+        <w:t xml:space="preserve">    "</w:t>
+      </w:r>
+      <w:proofErr w:type="spellStart"/>
+      <w:r>
+        <w:t>JudgeId</w:t>
+      </w:r>
+      <w:proofErr w:type="spellEnd"/>
+      <w:r>
+        <w:t>": 154,</w:t>
+      </w:r>
+      <w:r>
+        <w:br/>
+        <w:t xml:space="preserve">    "</w:t>
+      </w:r>
+      <w:proofErr w:type="spellStart"/>
+      <w:r>
+        <w:t>EventType</w:t>
+      </w:r>
+      <w:proofErr w:type="spellEnd"/>
+      <w:r>
+        <w:t xml:space="preserve">": </w:t>
       </w:r>
       <w:r>
         <w:t>"Continue"</w:t>
@@ -1878,11 +2520,27 @@
       </w:r>
       <w:r>
         <w:br/>
-        <w:t xml:space="preserve">    "OtherEventType": "User Value",</w:t>
-      </w:r>
-      <w:r>
-        <w:br/>
-        <w:t xml:space="preserve">    "EventDateTime": "2026-04-15 10:30:00",</w:t>
+        <w:t xml:space="preserve">    "</w:t>
+      </w:r>
+      <w:proofErr w:type="spellStart"/>
+      <w:r>
+        <w:t>OtherEventType</w:t>
+      </w:r>
+      <w:proofErr w:type="spellEnd"/>
+      <w:r>
+        <w:t>": "User Value",</w:t>
+      </w:r>
+      <w:r>
+        <w:br/>
+        <w:t xml:space="preserve">    "</w:t>
+      </w:r>
+      <w:proofErr w:type="spellStart"/>
+      <w:r>
+        <w:t>EventDateTime</w:t>
+      </w:r>
+      <w:proofErr w:type="spellEnd"/>
+      <w:r>
+        <w:t>": "2026-04-15 10:30:00",</w:t>
       </w:r>
       <w:r>
         <w:br/>
@@ -1890,7 +2548,15 @@
       </w:r>
       <w:r>
         <w:br/>
-        <w:t xml:space="preserve">    "CourtRoomId": 25,</w:t>
+        <w:t xml:space="preserve">    "</w:t>
+      </w:r>
+      <w:proofErr w:type="spellStart"/>
+      <w:r>
+        <w:t>CourtRoomId</w:t>
+      </w:r>
+      <w:proofErr w:type="spellEnd"/>
+      <w:r>
+        <w:t>": 25,</w:t>
       </w:r>
       <w:r>
         <w:br/>
@@ -1928,8 +2594,21 @@
       </w:r>
       <w:proofErr w:type="gramEnd"/>
       <w:r>
-        <w:t>data": { ... }, "error": "" }</w:t>
-      </w:r>
+        <w:t xml:space="preserve">data": </w:t>
+      </w:r>
+      <w:proofErr w:type="gramStart"/>
+      <w:r>
+        <w:t>{ ...</w:t>
+      </w:r>
+      <w:proofErr w:type="gramEnd"/>
+      <w:r>
+        <w:t xml:space="preserve"> }, "error": "</w:t>
+      </w:r>
+      <w:proofErr w:type="gramStart"/>
+      <w:r>
+        <w:t>" }</w:t>
+      </w:r>
+      <w:proofErr w:type="gramEnd"/>
     </w:p>
     <w:p>
       <w:pPr>
@@ -1947,8 +2626,13 @@
       </w:r>
       <w:proofErr w:type="gramEnd"/>
       <w:r>
-        <w:t>data": null, "error": "Descriptive error message" }</w:t>
-      </w:r>
+        <w:t>data": null, "error": "Descriptive error message</w:t>
+      </w:r>
+      <w:proofErr w:type="gramStart"/>
+      <w:r>
+        <w:t>" }</w:t>
+      </w:r>
+      <w:proofErr w:type="gramEnd"/>
     </w:p>
     <w:p>
       <w:pPr>
@@ -1981,8 +2665,13 @@
         <w:t>Endpoint</w:t>
       </w:r>
       <w:r>
-        <w:t>: GET /getJudges</w:t>
-      </w:r>
+        <w:t>: GET /</w:t>
+      </w:r>
+      <w:proofErr w:type="spellStart"/>
+      <w:r>
+        <w:t>getJudges</w:t>
+      </w:r>
+      <w:proofErr w:type="spellEnd"/>
     </w:p>
     <w:p>
       <w:pPr>
@@ -2059,12 +2748,57 @@
       </w:r>
       <w:proofErr w:type="gramEnd"/>
       <w:r>
-        <w:t xml:space="preserve"> "JudgeId": 1, "JudgeName": "John Williams" },</w:t>
-      </w:r>
-      <w:r>
-        <w:br/>
-        <w:t xml:space="preserve">    { "JudgeId": 2, "JudgeName": "James Brown Jr." }</w:t>
-      </w:r>
+        <w:t xml:space="preserve"> "</w:t>
+      </w:r>
+      <w:proofErr w:type="spellStart"/>
+      <w:r>
+        <w:t>JudgeId</w:t>
+      </w:r>
+      <w:proofErr w:type="spellEnd"/>
+      <w:r>
+        <w:t>": 1, "</w:t>
+      </w:r>
+      <w:proofErr w:type="spellStart"/>
+      <w:r>
+        <w:t>JudgeName</w:t>
+      </w:r>
+      <w:proofErr w:type="spellEnd"/>
+      <w:r>
+        <w:t>": "John Williams" },</w:t>
+      </w:r>
+      <w:r>
+        <w:br/>
+        <w:t xml:space="preserve"> </w:t>
+      </w:r>
+      <w:proofErr w:type="gramStart"/>
+      <w:r>
+        <w:t xml:space="preserve">   {</w:t>
+      </w:r>
+      <w:proofErr w:type="gramEnd"/>
+      <w:r>
+        <w:t xml:space="preserve"> "</w:t>
+      </w:r>
+      <w:proofErr w:type="spellStart"/>
+      <w:r>
+        <w:t>JudgeId</w:t>
+      </w:r>
+      <w:proofErr w:type="spellEnd"/>
+      <w:r>
+        <w:t>": 2, "</w:t>
+      </w:r>
+      <w:proofErr w:type="spellStart"/>
+      <w:r>
+        <w:t>JudgeName</w:t>
+      </w:r>
+      <w:proofErr w:type="spellEnd"/>
+      <w:r>
+        <w:t>": "James Brown Jr.</w:t>
+      </w:r>
+      <w:proofErr w:type="gramStart"/>
+      <w:r>
+        <w:t>" }</w:t>
+      </w:r>
+      <w:proofErr w:type="gramEnd"/>
       <w:r>
         <w:br/>
         <w:t xml:space="preserve">  ],</w:t>
@@ -2101,8 +2835,13 @@
         <w:t>Endpoint</w:t>
       </w:r>
       <w:r>
-        <w:t>: GET /getCourtrooms</w:t>
-      </w:r>
+        <w:t>: GET /</w:t>
+      </w:r>
+      <w:proofErr w:type="spellStart"/>
+      <w:r>
+        <w:t>getCourtrooms</w:t>
+      </w:r>
+      <w:proofErr w:type="spellEnd"/>
     </w:p>
     <w:p>
       <w:pPr>
@@ -2179,12 +2918,57 @@
       </w:r>
       <w:proofErr w:type="gramEnd"/>
       <w:r>
-        <w:t xml:space="preserve"> "CourtRoomId": 1, "CourtRoomName": "2A" },</w:t>
-      </w:r>
-      <w:r>
-        <w:br/>
-        <w:t xml:space="preserve">    { "CourtRoomId": 2, "CourtRoomName": "3B" }</w:t>
-      </w:r>
+        <w:t xml:space="preserve"> "</w:t>
+      </w:r>
+      <w:proofErr w:type="spellStart"/>
+      <w:r>
+        <w:t>CourtRoomId</w:t>
+      </w:r>
+      <w:proofErr w:type="spellEnd"/>
+      <w:r>
+        <w:t>": 1, "</w:t>
+      </w:r>
+      <w:proofErr w:type="spellStart"/>
+      <w:r>
+        <w:t>CourtRoomName</w:t>
+      </w:r>
+      <w:proofErr w:type="spellEnd"/>
+      <w:r>
+        <w:t>": "2A" },</w:t>
+      </w:r>
+      <w:r>
+        <w:br/>
+        <w:t xml:space="preserve"> </w:t>
+      </w:r>
+      <w:proofErr w:type="gramStart"/>
+      <w:r>
+        <w:t xml:space="preserve">   {</w:t>
+      </w:r>
+      <w:proofErr w:type="gramEnd"/>
+      <w:r>
+        <w:t xml:space="preserve"> "</w:t>
+      </w:r>
+      <w:proofErr w:type="spellStart"/>
+      <w:r>
+        <w:t>CourtRoomId</w:t>
+      </w:r>
+      <w:proofErr w:type="spellEnd"/>
+      <w:r>
+        <w:t>": 2, "</w:t>
+      </w:r>
+      <w:proofErr w:type="spellStart"/>
+      <w:r>
+        <w:t>CourtRoomName</w:t>
+      </w:r>
+      <w:proofErr w:type="spellEnd"/>
+      <w:r>
+        <w:t>": "3B</w:t>
+      </w:r>
+      <w:proofErr w:type="gramStart"/>
+      <w:r>
+        <w:t>" }</w:t>
+      </w:r>
+      <w:proofErr w:type="gramEnd"/>
       <w:r>
         <w:br/>
         <w:t xml:space="preserve">  ],</w:t>
@@ -2277,7 +3061,15 @@
         </w:numPr>
       </w:pPr>
       <w:r>
-        <w:t>404 Not Found: Resource (e.g., EventId) not found.</w:t>
+        <w:t xml:space="preserve">404 Not Found: Resource (e.g., </w:t>
+      </w:r>
+      <w:proofErr w:type="spellStart"/>
+      <w:r>
+        <w:t>EventId</w:t>
+      </w:r>
+      <w:proofErr w:type="spellEnd"/>
+      <w:r>
+        <w:t>) not found.</w:t>
       </w:r>
     </w:p>
     <w:p>
@@ -2314,8 +3106,13 @@
       </w:r>
       <w:proofErr w:type="gramEnd"/>
       <w:r>
-        <w:t>data": null, "error": "Detailed descriptive message" }</w:t>
-      </w:r>
+        <w:t>data": null, "error": "Detailed descriptive message</w:t>
+      </w:r>
+      <w:proofErr w:type="gramStart"/>
+      <w:r>
+        <w:t>" }</w:t>
+      </w:r>
+      <w:proofErr w:type="gramEnd"/>
     </w:p>
     <w:p>
       <w:pPr>

</xml_diff>